<commit_message>
done with exercise trimming
also needed to get rid of <p> inside <outcomes>
need to figure out why some <p> are showing yellow, not supposed to be there?
</commit_message>
<xml_diff>
--- a/WebWork Notes/By Hand problems.docx
+++ b/WebWork Notes/By Hand problems.docx
@@ -55,6 +55,179 @@
         </w:drawing>
       </w:r>
     </w:p>
+    <w:p>
+      <w:r>
+        <w:t> Let &lt;m&gt;h(</w:t>
+      </w:r>
+      <w:proofErr w:type="spellStart"/>
+      <w:proofErr w:type="gramStart"/>
+      <w:r>
+        <w:t>x,y</w:t>
+      </w:r>
+      <w:proofErr w:type="gramEnd"/>
+      <w:r>
+        <w:t>,z</w:t>
+      </w:r>
+      <w:proofErr w:type="spellEnd"/>
+      <w:r>
+        <w:t>)&lt;/m&gt; be a smooth function of three variables and let &lt;m&gt;\</w:t>
+      </w:r>
+      <w:proofErr w:type="spellStart"/>
+      <w:r>
+        <w:t>vF</w:t>
+      </w:r>
+      <w:proofErr w:type="spellEnd"/>
+      <w:r>
+        <w:t>=grad(h)=\</w:t>
+      </w:r>
+      <w:proofErr w:type="spellStart"/>
+      <w:r>
+        <w:t>nabla</w:t>
+      </w:r>
+      <w:proofErr w:type="spellEnd"/>
+      <w:r>
+        <w:t>{h}&lt;/m&gt;.</w:t>
+      </w:r>
+    </w:p>
+    <w:p>
+      <w:r>
+        <w:t>            &lt;</w:t>
+      </w:r>
+      <w:proofErr w:type="spellStart"/>
+      <w:r>
+        <w:t>ol</w:t>
+      </w:r>
+      <w:proofErr w:type="spellEnd"/>
+      <w:r>
+        <w:t>&gt;</w:t>
+      </w:r>
+    </w:p>
+    <w:p>
+      <w:r>
+        <w:t>              &lt;li&gt;Write out the component functions of &lt;m&gt;\</w:t>
+      </w:r>
+      <w:proofErr w:type="spellStart"/>
+      <w:r>
+        <w:t>vF</w:t>
+      </w:r>
+      <w:proofErr w:type="spellEnd"/>
+      <w:r>
+        <w:t>&lt;/m&gt; in terms of partial derivatives of &lt;m&gt;h&lt;/m</w:t>
+      </w:r>
+      <w:proofErr w:type="gramStart"/>
+      <w:r>
+        <w:t>&gt;.&lt;</w:t>
+      </w:r>
+      <w:proofErr w:type="gramEnd"/>
+      <w:r>
+        <w:t>/li&gt;</w:t>
+      </w:r>
+    </w:p>
+    <w:p>
+      <w:r>
+        <w:t>              &lt;li&gt;Show that &lt;m&gt;curl(\</w:t>
+      </w:r>
+      <w:proofErr w:type="spellStart"/>
+      <w:proofErr w:type="gramStart"/>
+      <w:r>
+        <w:t>vF</w:t>
+      </w:r>
+      <w:proofErr w:type="spellEnd"/>
+      <w:r>
+        <w:t>)=</w:t>
+      </w:r>
+      <w:proofErr w:type="gramEnd"/>
+      <w:r>
+        <w:t>\</w:t>
+      </w:r>
+      <w:proofErr w:type="spellStart"/>
+      <w:r>
+        <w:t>vec</w:t>
+      </w:r>
+      <w:proofErr w:type="spellEnd"/>
+      <w:r>
+        <w:t>{0}&lt;/m&gt;.&lt;/li&gt;</w:t>
+      </w:r>
+    </w:p>
+    <w:p>
+      <w:r>
+        <w:t>              &lt;li&gt;A vector field is curl free if &lt;m&gt;curl(\</w:t>
+      </w:r>
+      <w:proofErr w:type="spellStart"/>
+      <w:proofErr w:type="gramStart"/>
+      <w:r>
+        <w:t>vF</w:t>
+      </w:r>
+      <w:proofErr w:type="spellEnd"/>
+      <w:r>
+        <w:t>)=</w:t>
+      </w:r>
+      <w:proofErr w:type="gramEnd"/>
+      <w:r>
+        <w:t>\</w:t>
+      </w:r>
+      <w:proofErr w:type="spellStart"/>
+      <w:r>
+        <w:t>vec</w:t>
+      </w:r>
+      <w:proofErr w:type="spellEnd"/>
+      <w:r>
+        <w:t>{0}&lt;/m&gt;. If the component functions of a vector field &lt;m&gt;\</w:t>
+      </w:r>
+      <w:proofErr w:type="spellStart"/>
+      <w:r>
+        <w:t>vG</w:t>
+      </w:r>
+      <w:proofErr w:type="spellEnd"/>
+      <w:r>
+        <w:t>&lt;/m&gt; have continuous first partial derivatives on an open region of space, then &lt;m&gt;curl(\</w:t>
+      </w:r>
+      <w:proofErr w:type="spellStart"/>
+      <w:proofErr w:type="gramStart"/>
+      <w:r>
+        <w:t>vG</w:t>
+      </w:r>
+      <w:proofErr w:type="spellEnd"/>
+      <w:r>
+        <w:t>)=</w:t>
+      </w:r>
+      <w:proofErr w:type="gramEnd"/>
+      <w:r>
+        <w:t>\</w:t>
+      </w:r>
+      <w:proofErr w:type="spellStart"/>
+      <w:r>
+        <w:t>vec</w:t>
+      </w:r>
+      <w:proofErr w:type="spellEnd"/>
+      <w:r>
+        <w:t xml:space="preserve">{0}&lt;/m&gt; </w:t>
+      </w:r>
+      <w:proofErr w:type="spellStart"/>
+      <w:r>
+        <w:t>iff</w:t>
+      </w:r>
+      <w:proofErr w:type="spellEnd"/>
+      <w:r>
+        <w:t xml:space="preserve"> &lt;m&gt;\</w:t>
+      </w:r>
+      <w:proofErr w:type="spellStart"/>
+      <w:r>
+        <w:t>vG</w:t>
+      </w:r>
+      <w:proofErr w:type="spellEnd"/>
+      <w:r>
+        <w:t xml:space="preserve">&lt;/m&gt; is conservative. </w:t>
+      </w:r>
+      <w:proofErr w:type="gramStart"/>
+      <w:r>
+        <w:t>Need</w:t>
+      </w:r>
+      <w:proofErr w:type="gramEnd"/>
+      <w:r>
+        <w:t xml:space="preserve"> to fill out how this should work as an exercise.</w:t>
+      </w:r>
+    </w:p>
     <w:p/>
     <w:p>
       <w:r>
@@ -143,6 +316,9 @@
       </w:r>
       <w:r>
         <w:br/>
+      </w:r>
+      <w:r>
+        <w:lastRenderedPageBreak/>
         <w:t>10.1 Library/maCalcDB/setParametric1Curves/ur_pa_1_6.pg (</w:t>
       </w:r>
       <w:proofErr w:type="spellStart"/>
@@ -167,7 +343,6 @@
     <w:p/>
     <w:p>
       <w:r>
-        <w:lastRenderedPageBreak/>
         <w:t>9.3:</w:t>
       </w:r>
     </w:p>
@@ -219,6 +394,33 @@
         </w:drawing>
       </w:r>
     </w:p>
+    <w:p>
+      <w:r>
+        <w:lastRenderedPageBreak/>
+        <w:t>Flux integrals</w:t>
+      </w:r>
+    </w:p>
+    <w:p>
+      <w:r>
+        <w:t>Compute the flux of 1,2,3 through a plane, a cylinder, a cylinder with top and bottom, and a sphere. Use your work here to answer: If S is a closed surface (explain what this is), what do you think the flux of F through S will be?</w:t>
+      </w:r>
+    </w:p>
+    <w:p>
+      <w:r>
+        <w:t>Line int param</w:t>
+      </w:r>
+    </w:p>
+    <w:p>
+      <w:proofErr w:type="gramStart"/>
+      <w:r>
+        <w:t>&lt;!--</w:t>
+      </w:r>
+      <w:proofErr w:type="gramEnd"/>
+      <w:r>
+        <w:t>TODO: Exercise on converting between notations. Ask them what changes in this formula if the vector field changes, etc.--&gt;</w:t>
+      </w:r>
+    </w:p>
+    <w:p/>
     <w:sectPr>
       <w:pgSz w:w="12240" w:h="15840"/>
       <w:pgMar w:top="1440" w:right="1440" w:bottom="1440" w:left="1440" w:header="720" w:footer="720" w:gutter="0"/>

</xml_diff>